<commit_message>
Data preparation: feature selection, encoding, holdout split
</commit_message>
<xml_diff>
--- a/docs/Project plan.docx
+++ b/docs/Project plan.docx
@@ -20,10 +20,16 @@
       </w:r>
     </w:p>
     <w:p>
+      <w:pPr>
+        <w:rPr>
+          <w:strike/>
+        </w:rPr>
+      </w:pPr>
       <w:r>
         <w:rPr>
           <w:b/>
           <w:bCs/>
+          <w:strike/>
         </w:rPr>
         <w:t>Phase 1 — Setup &amp; Data Acquisition</w:t>
       </w:r>
@@ -54,11 +60,13 @@
           <w:numId w:val="1"/>
         </w:numPr>
         <w:rPr>
-          <w:lang w:val="en-US"/>
-        </w:rPr>
-      </w:pPr>
-      <w:r>
-        <w:rPr>
+          <w:strike/>
+          <w:lang w:val="en-US"/>
+        </w:rPr>
+      </w:pPr>
+      <w:r>
+        <w:rPr>
+          <w:strike/>
           <w:lang w:val="en-US"/>
         </w:rPr>
         <w:t>Set up virtual environment and requirements.txt</w:t>
@@ -71,11 +79,13 @@
           <w:numId w:val="1"/>
         </w:numPr>
         <w:rPr>
-          <w:lang w:val="en-US"/>
-        </w:rPr>
-      </w:pPr>
-      <w:r>
-        <w:rPr>
+          <w:strike/>
+          <w:lang w:val="en-US"/>
+        </w:rPr>
+      </w:pPr>
+      <w:r>
+        <w:rPr>
+          <w:strike/>
           <w:lang w:val="en-US"/>
         </w:rPr>
         <w:t>Download DataCo SMART SUPPLY CHAIN dataset from Kaggle</w:t>
@@ -88,11 +98,13 @@
           <w:numId w:val="1"/>
         </w:numPr>
         <w:rPr>
-          <w:lang w:val="en-US"/>
-        </w:rPr>
-      </w:pPr>
-      <w:r>
-        <w:rPr>
+          <w:strike/>
+          <w:lang w:val="en-US"/>
+        </w:rPr>
+      </w:pPr>
+      <w:r>
+        <w:rPr>
+          <w:strike/>
           <w:lang w:val="en-US"/>
         </w:rPr>
         <w:t>Initial data exploration — shape, dtypes, nulls, basic stats</w:t>
@@ -101,6 +113,7 @@
     <w:p>
       <w:pPr>
         <w:rPr>
+          <w:strike/>
           <w:lang w:val="en-US"/>
         </w:rPr>
       </w:pPr>
@@ -108,12 +121,14 @@
         <w:rPr>
           <w:b/>
           <w:bCs/>
+          <w:strike/>
           <w:lang w:val="en-US"/>
         </w:rPr>
         <w:t>Phase 2 — Data Preparation</w:t>
       </w:r>
       <w:r>
         <w:rPr>
+          <w:strike/>
           <w:lang w:val="en-US"/>
         </w:rPr>
         <w:t xml:space="preserve"> 5. Define the pre-shipment feature set (eliminate leaky columns) 6. Confirm and finalize target variable (Late_delivery_risk) 7. Handle missing values and outliers 8. Type casting and feature encoding (categorical → numerical) 9. Feature selection and correlation analysis</w:t>
@@ -1014,6 +1029,7 @@
   <w:style w:type="character" w:default="1" w:styleId="DefaultParagraphFont">
     <w:name w:val="Default Paragraph Font"/>
     <w:uiPriority w:val="1"/>
+    <w:semiHidden/>
     <w:unhideWhenUsed/>
   </w:style>
   <w:style w:type="table" w:default="1" w:styleId="TableNormal">

</xml_diff>

<commit_message>
EDA, modeling, comparison, scaler
</commit_message>
<xml_diff>
--- a/docs/Project plan.docx
+++ b/docs/Project plan.docx
@@ -137,6 +137,7 @@
     <w:p>
       <w:pPr>
         <w:rPr>
+          <w:strike/>
           <w:lang w:val="en-US"/>
         </w:rPr>
       </w:pPr>
@@ -144,12 +145,14 @@
         <w:rPr>
           <w:b/>
           <w:bCs/>
+          <w:strike/>
           <w:lang w:val="en-US"/>
         </w:rPr>
         <w:t>Phase 3 — Exploratory Data Analysis (EDA)</w:t>
       </w:r>
       <w:r>
         <w:rPr>
+          <w:strike/>
           <w:lang w:val="en-US"/>
         </w:rPr>
         <w:t xml:space="preserve"> 10. Univariate and bivariate analysis 11. Delivery performance analysis by region, shipping mode, customer segment 12. Statistical analysis — distributions, correlations, variance 13. Export clean dataset for Tableau</w:t>
@@ -208,7 +211,20 @@
         <w:rPr>
           <w:lang w:val="en-US"/>
         </w:rPr>
-        <w:t xml:space="preserve"> 17. Train/test split and preprocessing pipeline (scaling, encoding) 18. Baseline model — Logistic Regression 19. Advanced models — XGBoost / LightGBM 20. Deep Learning </w:t>
+        <w:t xml:space="preserve"> </w:t>
+      </w:r>
+      <w:r>
+        <w:rPr>
+          <w:strike/>
+          <w:lang w:val="en-US"/>
+        </w:rPr>
+        <w:t xml:space="preserve">17. Train/test split and preprocessing pipeline (scaling, encoding) 18. Baseline model — Logistic Regression 19. Advanced models — XGBoost / LightGBM </w:t>
+      </w:r>
+      <w:r>
+        <w:rPr>
+          <w:lang w:val="en-US"/>
+        </w:rPr>
+        <w:t xml:space="preserve">20. Deep Learning </w:t>
       </w:r>
       <w:proofErr w:type="gramStart"/>
       <w:r>

</xml_diff>

<commit_message>
ML models, Gen AI component, holdout evaluation complete
</commit_message>
<xml_diff>
--- a/docs/Project plan.docx
+++ b/docs/Project plan.docx
@@ -196,6 +196,7 @@
     <w:p>
       <w:pPr>
         <w:rPr>
+          <w:strike/>
           <w:lang w:val="en-US"/>
         </w:rPr>
       </w:pPr>
@@ -203,32 +204,22 @@
         <w:rPr>
           <w:b/>
           <w:bCs/>
+          <w:strike/>
           <w:lang w:val="en-US"/>
         </w:rPr>
         <w:t>Phase 5 — Machine Learning</w:t>
       </w:r>
       <w:r>
         <w:rPr>
-          <w:lang w:val="en-US"/>
-        </w:rPr>
-        <w:t xml:space="preserve"> </w:t>
-      </w:r>
-      <w:r>
-        <w:rPr>
-          <w:strike/>
-          <w:lang w:val="en-US"/>
-        </w:rPr>
-        <w:t xml:space="preserve">17. Train/test split and preprocessing pipeline (scaling, encoding) 18. Baseline model — Logistic Regression 19. Advanced models — XGBoost / LightGBM </w:t>
-      </w:r>
-      <w:r>
-        <w:rPr>
-          <w:lang w:val="en-US"/>
-        </w:rPr>
-        <w:t xml:space="preserve">20. Deep Learning </w:t>
+          <w:strike/>
+          <w:lang w:val="en-US"/>
+        </w:rPr>
+        <w:t xml:space="preserve"> 17. Train/test split and preprocessing pipeline (scaling, encoding) 18. Baseline model — Logistic Regression 19. Advanced models — XGBoost / LightGBM 20. Deep Learning </w:t>
       </w:r>
       <w:proofErr w:type="gramStart"/>
       <w:r>
         <w:rPr>
+          <w:strike/>
           <w:lang w:val="en-US"/>
         </w:rPr>
         <w:t>comparison — simple feedforward neural network</w:t>
@@ -236,6 +227,7 @@
       <w:proofErr w:type="gramEnd"/>
       <w:r>
         <w:rPr>
+          <w:strike/>
           <w:lang w:val="en-US"/>
         </w:rPr>
         <w:t xml:space="preserve"> 21. Hyperparameter tuning (GridSearch or Optuna) 22. Model evaluation and selection (F1, Precision, Recall, ROC-AUC) 23. Feature importance analysis</w:t>
@@ -244,6 +236,7 @@
     <w:p>
       <w:pPr>
         <w:rPr>
+          <w:strike/>
           <w:lang w:val="en-US"/>
         </w:rPr>
       </w:pPr>
@@ -251,12 +244,14 @@
         <w:rPr>
           <w:b/>
           <w:bCs/>
+          <w:strike/>
           <w:lang w:val="en-US"/>
         </w:rPr>
         <w:t>Phase 6 — Gen AI Component</w:t>
       </w:r>
       <w:r>
         <w:rPr>
+          <w:strike/>
           <w:lang w:val="en-US"/>
         </w:rPr>
         <w:t xml:space="preserve"> 24. Design prompt template using model prediction context (risk score + key features) 25. Build script that takes a high-risk order and generates recovery actions via LLM 26. Test and refine outputs for business relevance</w:t>
@@ -284,6 +279,11 @@
       </w:r>
     </w:p>
     <w:p>
+      <w:pPr>
+        <w:rPr>
+          <w:lang w:val="en-US"/>
+        </w:rPr>
+      </w:pPr>
       <w:r>
         <w:rPr>
           <w:b/>
@@ -299,18 +299,12 @@
         <w:t xml:space="preserve"> 28. Write README.md (goals, methodology, results) 29. Clean and document all code / notebooks 30. Build final presentation slides (15-20 min) 31. </w:t>
       </w:r>
       <w:r>
-        <w:t xml:space="preserve">Final </w:t>
-      </w:r>
-      <w:proofErr w:type="spellStart"/>
-      <w:r>
-        <w:t>commit</w:t>
-      </w:r>
-      <w:proofErr w:type="spellEnd"/>
-      <w:r>
-        <w:t xml:space="preserve"> and push</w:t>
+        <w:rPr>
+          <w:lang w:val="en-US"/>
+        </w:rPr>
+        <w:t>Final commit and push</w:t>
       </w:r>
     </w:p>
-    <w:p/>
     <w:sectPr>
       <w:pgSz w:w="11906" w:h="16838"/>
       <w:pgMar w:top="1417" w:right="1417" w:bottom="1134" w:left="1417" w:header="720" w:footer="720" w:gutter="0"/>

</xml_diff>